<commit_message>
fix: unified placeholders in word template
</commit_message>
<xml_diff>
--- a/word_templates/long_form_template.docx
+++ b/word_templates/long_form_template.docx
@@ -2559,7 +2559,21 @@
           <w:sz w:val="22"/>
           <w:szCs w:val="22"/>
         </w:rPr>
-        <w:t>{{X-AXIS_REFERENCE}}</w:t>
+        <w:t>{{X</w:t>
+      </w:r>
+      <w:r>
+        <w:rPr>
+          <w:sz w:val="22"/>
+          <w:szCs w:val="22"/>
+        </w:rPr>
+        <w:t>_</w:t>
+      </w:r>
+      <w:r>
+        <w:rPr>
+          <w:sz w:val="22"/>
+          <w:szCs w:val="22"/>
+        </w:rPr>
+        <w:t>AXIS_REFERENCE}}</w:t>
       </w:r>
     </w:p>
     <w:p>
@@ -2607,7 +2621,21 @@
           <w:sz w:val="22"/>
           <w:szCs w:val="22"/>
         </w:rPr>
-        <w:t>{{Y-AXIS_REFERENCE}}</w:t>
+        <w:t>{{Y</w:t>
+      </w:r>
+      <w:r>
+        <w:rPr>
+          <w:sz w:val="22"/>
+          <w:szCs w:val="22"/>
+        </w:rPr>
+        <w:t>_</w:t>
+      </w:r>
+      <w:r>
+        <w:rPr>
+          <w:sz w:val="22"/>
+          <w:szCs w:val="22"/>
+        </w:rPr>
+        <w:t>AXIS_REFERENCE}}</w:t>
       </w:r>
     </w:p>
     <w:p>
@@ -3247,16 +3275,8 @@
                               <w:rPr>
                                 <w:sz w:val="20"/>
                               </w:rPr>
-                              <w:t xml:space="preserve">= Encoded </w:t>
+                              <w:t>= Encoded HydroFORM</w:t>
                             </w:r>
-                            <w:proofErr w:type="spellStart"/>
-                            <w:r>
-                              <w:rPr>
-                                <w:sz w:val="20"/>
-                              </w:rPr>
-                              <w:t>HydroFORM</w:t>
-                            </w:r>
-                            <w:proofErr w:type="spellEnd"/>
                           </w:p>
                         </w:txbxContent>
                       </wps:txbx>
@@ -3294,16 +3314,8 @@
                         <w:rPr>
                           <w:sz w:val="20"/>
                         </w:rPr>
-                        <w:t xml:space="preserve">= Encoded </w:t>
+                        <w:t>= Encoded HydroFORM</w:t>
                       </w:r>
-                      <w:proofErr w:type="spellStart"/>
-                      <w:r>
-                        <w:rPr>
-                          <w:sz w:val="20"/>
-                        </w:rPr>
-                        <w:t>HydroFORM</w:t>
-                      </w:r>
-                      <w:proofErr w:type="spellEnd"/>
                     </w:p>
                   </w:txbxContent>
                 </v:textbox>
@@ -3554,23 +3566,16 @@
         <w:pStyle w:val="Heading2"/>
       </w:pPr>
       <w:bookmarkStart w:id="9" w:name="_Toc157005996"/>
-      <w:proofErr w:type="gramStart"/>
       <w:r>
         <w:t>Equipment</w:t>
       </w:r>
       <w:r>
-        <w:t xml:space="preserve"> Details</w:t>
-      </w:r>
-      <w:proofErr w:type="gramEnd"/>
-      <w:r>
-        <w:t xml:space="preserve">: </w:t>
-      </w:r>
-      <w:proofErr w:type="spellStart"/>
+        <w:t xml:space="preserve"> Details: </w:t>
+      </w:r>
       <w:r>
         <w:t>HydroFORM</w:t>
       </w:r>
       <w:bookmarkEnd w:id="9"/>
-      <w:proofErr w:type="spellEnd"/>
     </w:p>
     <w:tbl>
       <w:tblPr>
@@ -3933,19 +3938,11 @@
               </w:rPr>
               <w:t>S/</w:t>
             </w:r>
-            <w:proofErr w:type="gramStart"/>
             <w:r>
               <w:rPr>
                 <w:sz w:val="20"/>
               </w:rPr>
-              <w:t>N: {{</w:t>
-            </w:r>
-            <w:proofErr w:type="gramEnd"/>
-            <w:r>
-              <w:rPr>
-                <w:sz w:val="20"/>
-              </w:rPr>
-              <w:t>TRANSDUCER_SERIAL}}</w:t>
+              <w:t>N: {{TRANSDUCER_SERIAL}}</w:t>
             </w:r>
             <w:r>
               <w:rPr>
@@ -4367,27 +4364,13 @@
               <w:rPr>
                 <w:sz w:val="20"/>
               </w:rPr>
-              <w:t>{{MATERIAL_TEMP</w:t>
-            </w:r>
-            <w:proofErr w:type="gramStart"/>
-            <w:r>
-              <w:rPr>
-                <w:sz w:val="20"/>
-              </w:rPr>
-              <w:t>}}</w:t>
+              <w:t>{{MATERIAL_TEMP}}</w:t>
             </w:r>
             <w:r>
               <w:rPr>
                 <w:sz w:val="20"/>
               </w:rPr>
-              <w:t>°</w:t>
-            </w:r>
-            <w:proofErr w:type="gramEnd"/>
-            <w:r>
-              <w:rPr>
-                <w:sz w:val="20"/>
-              </w:rPr>
-              <w:t>F</w:t>
+              <w:t>°F</w:t>
             </w:r>
           </w:p>
         </w:tc>
@@ -4495,27 +4478,13 @@
               <w:rPr>
                 <w:sz w:val="20"/>
               </w:rPr>
-              <w:t>S/</w:t>
-            </w:r>
-            <w:proofErr w:type="gramStart"/>
-            <w:r>
-              <w:rPr>
-                <w:sz w:val="20"/>
-              </w:rPr>
-              <w:t>N:</w:t>
+              <w:t>S/N:</w:t>
             </w:r>
             <w:r>
               <w:rPr>
                 <w:sz w:val="20"/>
               </w:rPr>
-              <w:t xml:space="preserve"> {{</w:t>
-            </w:r>
-            <w:proofErr w:type="gramEnd"/>
-            <w:r>
-              <w:rPr>
-                <w:sz w:val="20"/>
-              </w:rPr>
-              <w:t>CAL_BLOCK_SERIAL</w:t>
+              <w:t xml:space="preserve"> {{CAL_BLOCK_SERIAL</w:t>
             </w:r>
           </w:p>
         </w:tc>
@@ -4565,7 +4534,19 @@
               <w:rPr>
                 <w:sz w:val="20"/>
               </w:rPr>
-              <w:t>{{SURFACE PREP}}</w:t>
+              <w:t>{{SURFACE</w:t>
+            </w:r>
+            <w:r>
+              <w:rPr>
+                <w:sz w:val="20"/>
+              </w:rPr>
+              <w:t>_</w:t>
+            </w:r>
+            <w:r>
+              <w:rPr>
+                <w:sz w:val="20"/>
+              </w:rPr>
+              <w:t>PREP}}</w:t>
             </w:r>
           </w:p>
         </w:tc>
@@ -4946,21 +4927,7 @@
         <w:rPr>
           <w:szCs w:val="24"/>
         </w:rPr>
-        <w:t xml:space="preserve">Following the tables below will be color images for specific areas of interest. The cross-section markers will typically be </w:t>
-      </w:r>
-      <w:proofErr w:type="gramStart"/>
-      <w:r>
-        <w:rPr>
-          <w:szCs w:val="24"/>
-        </w:rPr>
-        <w:t>in the area of</w:t>
-      </w:r>
-      <w:proofErr w:type="gramEnd"/>
-      <w:r>
-        <w:rPr>
-          <w:szCs w:val="24"/>
-        </w:rPr>
-        <w:t xml:space="preserve"> the most significant corrosion or in an area of interest such as largest indication.</w:t>
+        <w:t>Following the tables below will be color images for specific areas of interest. The cross-section markers will typically be in the area of the most significant corrosion or in an area of interest such as largest indication.</w:t>
       </w:r>
     </w:p>
     <w:p>
@@ -5086,21 +5053,7 @@
               <w:rPr>
                 <w:b/>
               </w:rPr>
-              <w:t xml:space="preserve">PAUT </w:t>
-            </w:r>
-            <w:proofErr w:type="spellStart"/>
-            <w:r>
-              <w:rPr>
-                <w:b/>
-              </w:rPr>
-              <w:t>HydroFORM</w:t>
-            </w:r>
-            <w:proofErr w:type="spellEnd"/>
-            <w:r>
-              <w:rPr>
-                <w:b/>
-              </w:rPr>
-              <w:t xml:space="preserve"> Work Scope</w:t>
+              <w:t>PAUT HydroFORM Work Scope</w:t>
             </w:r>
           </w:p>
           <w:p>
@@ -5299,25 +5252,7 @@
                 <w:sz w:val="18"/>
                 <w:szCs w:val="18"/>
               </w:rPr>
-              <w:t xml:space="preserve">Average </w:t>
-            </w:r>
-            <w:proofErr w:type="spellStart"/>
-            <w:r>
-              <w:rPr>
-                <w:b/>
-                <w:sz w:val="18"/>
-                <w:szCs w:val="18"/>
-              </w:rPr>
-              <w:t>Thk</w:t>
-            </w:r>
-            <w:proofErr w:type="spellEnd"/>
-            <w:r>
-              <w:rPr>
-                <w:b/>
-                <w:sz w:val="18"/>
-                <w:szCs w:val="18"/>
-              </w:rPr>
-              <w:t xml:space="preserve"> (in.)</w:t>
+              <w:t>Average Thk (in.)</w:t>
             </w:r>
           </w:p>
         </w:tc>
@@ -5348,25 +5283,7 @@
                 <w:sz w:val="18"/>
                 <w:szCs w:val="18"/>
               </w:rPr>
-              <w:t xml:space="preserve">Min. </w:t>
-            </w:r>
-            <w:proofErr w:type="spellStart"/>
-            <w:r>
-              <w:rPr>
-                <w:b/>
-                <w:sz w:val="18"/>
-                <w:szCs w:val="18"/>
-              </w:rPr>
-              <w:t>Thk</w:t>
-            </w:r>
-            <w:proofErr w:type="spellEnd"/>
-            <w:r>
-              <w:rPr>
-                <w:b/>
-                <w:sz w:val="18"/>
-                <w:szCs w:val="18"/>
-              </w:rPr>
-              <w:t xml:space="preserve"> (in.)</w:t>
+              <w:t>Min. Thk (in.)</w:t>
             </w:r>
           </w:p>
         </w:tc>

</xml_diff>

<commit_message>
updated find and replace functions
</commit_message>
<xml_diff>
--- a/word_templates/long_form_template.docx
+++ b/word_templates/long_form_template.docx
@@ -4060,6 +4060,12 @@
               </w:rPr>
               <w:t>{{WAVE_PROPOGATION</w:t>
             </w:r>
+            <w:r>
+              <w:rPr>
+                <w:sz w:val="20"/>
+              </w:rPr>
+              <w:t>}}</w:t>
+            </w:r>
           </w:p>
         </w:tc>
         <w:tc>
@@ -4485,6 +4491,12 @@
                 <w:sz w:val="20"/>
               </w:rPr>
               <w:t xml:space="preserve"> {{CAL_BLOCK_SERIAL</w:t>
+            </w:r>
+            <w:r>
+              <w:rPr>
+                <w:sz w:val="20"/>
+              </w:rPr>
+              <w:t>}}</w:t>
             </w:r>
           </w:p>
         </w:tc>
@@ -6480,7 +6492,7 @@
         <w:i/>
         <w:noProof/>
       </w:rPr>
-      <w:t>13 February 2026</w:t>
+      <w:t>5 March 2026</w:t>
     </w:r>
     <w:r>
       <w:rPr>

</xml_diff>

<commit_message>
fixed typo, removed unused service
</commit_message>
<xml_diff>
--- a/word_templates/long_form_template.docx
+++ b/word_templates/long_form_template.docx
@@ -4097,7 +4097,19 @@
               <w:rPr>
                 <w:sz w:val="20"/>
               </w:rPr>
-              <w:t>{{WAVE_PROPOGATION</w:t>
+              <w:t>{{WAVE_PROP</w:t>
+            </w:r>
+            <w:r>
+              <w:rPr>
+                <w:sz w:val="20"/>
+              </w:rPr>
+              <w:t>A</w:t>
+            </w:r>
+            <w:r>
+              <w:rPr>
+                <w:sz w:val="20"/>
+              </w:rPr>
+              <w:t>GATION</w:t>
             </w:r>
             <w:r>
               <w:rPr>
@@ -6623,7 +6635,7 @@
         <w:i/>
         <w:noProof/>
       </w:rPr>
-      <w:t>16 March 2026</w:t>
+      <w:t>17 March 2026</w:t>
     </w:r>
     <w:r>
       <w:rPr>

</xml_diff>